<commit_message>
Manual: spacing after the two new tables, as elsewhere in the manual
Co-Authored-By: Claude Opus 5.5 <noreply@anthropic.com>
</commit_message>
<xml_diff>
--- a/NCA_Assistant_User_Manual_v1.8.docx
+++ b/NCA_Assistant_User_Manual_v1.8.docx
@@ -17882,6 +17882,11 @@
       <w:pPr>
         <w:spacing w:after="120" w:line="276" w:lineRule="auto"/>
       </w:pPr>
+    </w:p>
+    <w:p>
+      <w:pPr>
+        <w:spacing w:after="120" w:line="276" w:lineRule="auto"/>
+      </w:pPr>
       <w:r>
         <w:rPr>
           <w:b/>
@@ -34381,6 +34386,11 @@
         </w:tc>
       </w:tr>
     </w:tbl>
+    <w:p>
+      <w:pPr>
+        <w:spacing w:after="120" w:line="276" w:lineRule="auto"/>
+      </w:pPr>
+    </w:p>
     <w:p>
       <w:pPr>
         <w:spacing w:after="120" w:line="276" w:lineRule="auto"/>

</xml_diff>

<commit_message>
Manual: server example configuration and training installation steps
Appendix E gets example shiny-server.conf, nginx (WebSocket, one-hour read
timeout, 60 MB uploads), .Renviron and sudoers settings, and step-by-step
training installation for macOS/Linux and Windows. Admin commands use
sudo -H with the full path, so R reads the service account's .Renviron.
Protocol: IQ-GXP-15 checks uploads and long sessions through nginx.
.Renviron is ignored by git and not deployed.

Co-Authored-By: Claude Opus 5.5 <noreply@anthropic.com>
</commit_message>
<xml_diff>
--- a/NCA_Assistant_User_Manual_v1.8.docx
+++ b/NCA_Assistant_User_Manual_v1.8.docx
@@ -33768,7 +33768,7 @@
       </w:pPr>
       <w:r>
         <w:rPr/>
-        <w:t>1. Install R and the validated package versions from validation/renv.lock into the site library, including shinymanager, DBI and RSQLite.</w:t>
+        <w:t>1. Install R, the system programs zip (the Analysis Records are built with it) and logger (security alerts go through it; on most Linux systems it comes with util-linux or bsdutils), and the validated package versions from validation/renv.lock into the site library, including shinymanager, DBI and RSQLite.</w:t>
       </w:r>
     </w:p>
     <w:p>
@@ -33795,7 +33795,7 @@
       </w:pPr>
       <w:r>
         <w:rPr/>
-        <w:t>4. Put nginx in front of it with HTTPS only, redirecting HTTP, with WebSocket support.</w:t>
+        <w:t>4. Put nginx in front of it with HTTPS only, redirecting HTTP. Three settings differ from nginx's defaults: WebSocket forwarding (the app talks to the browser over a WebSocket), a read timeout of an hour so that an open session is not cut off, and an upload limit above the app's 50 MB (the default of 1 MB refuses most data files). The example below has all three.</w:t>
       </w:r>
     </w:p>
     <w:p>
@@ -33822,7 +33822,7 @@
       </w:pPr>
       <w:r>
         <w:rPr/>
-        <w:t>7. Add a sudoers rule that lets the system owner run exactly Rscript /srv/shiny-server/nca/gxp/manage_users.R as shiny, and nothing else. Root access stays with IT, with the operating system's audit logging.</w:t>
+        <w:t>7. Add a sudoers rule that lets the system owner run exactly Rscript /srv/shiny-server/nca/gxp/manage_users.R as shiny, and nothing else (example below). Root access stays with IT, with the operating system's audit logging.</w:t>
       </w:r>
     </w:p>
     <w:p>
@@ -33831,7 +33831,7 @@
       </w:pPr>
       <w:r>
         <w:rPr/>
-        <w:t>8. Run sudo -u shiny Rscript gxp/manage_users.R init.</w:t>
+        <w:t>8. Run sudo -H -u shiny Rscript /srv/shiny-server/nca/gxp/manage_users.R init. The -H matters: without it R reads the system owner's own .Renviron and does not find the settings.</w:t>
       </w:r>
     </w:p>
     <w:p>
@@ -33858,6 +33858,410 @@
       </w:pPr>
       <w:r>
         <w:rPr/>
+        <w:t>Example Configuration</w:t>
+      </w:r>
+    </w:p>
+    <w:p>
+      <w:pPr>
+        <w:spacing w:after="120" w:line="276" w:lineRule="auto"/>
+      </w:pPr>
+      <w:r>
+        <w:rPr/>
+        <w:t>Adapt the names, paths and address to your server. Lines starting with # are comments.</w:t>
+      </w:r>
+    </w:p>
+    <w:p>
+      <w:pPr>
+        <w:spacing w:after="120" w:line="276" w:lineRule="auto"/>
+      </w:pPr>
+      <w:r>
+        <w:rPr/>
+        <w:t>/etc/shiny-server/shiny-server.conf:</w:t>
+      </w:r>
+    </w:p>
+    <w:p>
+      <w:pPr>
+        <w:spacing w:after="160" w:line="276" w:lineRule="auto" w:before="40"/>
+        <w:ind w:left="283"/>
+        <w:shd w:val="clear" w:color="auto" w:fill="F2F2F2"/>
+      </w:pPr>
+      <w:r>
+        <w:rPr>
+          <w:rFonts w:ascii="Courier New" w:hAnsi="Courier New" w:eastAsia="Courier New"/>
+          <w:sz w:val="17"/>
+        </w:rPr>
+        <w:t>run_as shiny;</w:t>
+        <w:br/>
+      </w:r>
+      <w:r>
+        <w:rPr>
+          <w:rFonts w:ascii="Courier New" w:hAnsi="Courier New" w:eastAsia="Courier New"/>
+          <w:sz w:val="17"/>
+        </w:rPr>
+        <w:t>server {</w:t>
+        <w:br/>
+      </w:r>
+      <w:r>
+        <w:rPr>
+          <w:rFonts w:ascii="Courier New" w:hAnsi="Courier New" w:eastAsia="Courier New"/>
+          <w:sz w:val="17"/>
+        </w:rPr>
+        <w:t xml:space="preserve">  listen 3838 127.0.0.1;          # only nginx on the same server can reach it</w:t>
+        <w:br/>
+      </w:r>
+      <w:r>
+        <w:rPr>
+          <w:rFonts w:ascii="Courier New" w:hAnsi="Courier New" w:eastAsia="Courier New"/>
+          <w:sz w:val="17"/>
+        </w:rPr>
+        <w:t xml:space="preserve">  location / {</w:t>
+        <w:br/>
+      </w:r>
+      <w:r>
+        <w:rPr>
+          <w:rFonts w:ascii="Courier New" w:hAnsi="Courier New" w:eastAsia="Courier New"/>
+          <w:sz w:val="17"/>
+        </w:rPr>
+        <w:t xml:space="preserve">    site_dir /srv/shiny-server;</w:t>
+        <w:br/>
+      </w:r>
+      <w:r>
+        <w:rPr>
+          <w:rFonts w:ascii="Courier New" w:hAnsi="Courier New" w:eastAsia="Courier New"/>
+          <w:sz w:val="17"/>
+        </w:rPr>
+        <w:t xml:space="preserve">    log_dir /var/log/shiny-server;</w:t>
+        <w:br/>
+      </w:r>
+      <w:r>
+        <w:rPr>
+          <w:rFonts w:ascii="Courier New" w:hAnsi="Courier New" w:eastAsia="Courier New"/>
+          <w:sz w:val="17"/>
+        </w:rPr>
+        <w:t xml:space="preserve">    app_idle_timeout 0;           # keep the app running between users</w:t>
+        <w:br/>
+      </w:r>
+      <w:r>
+        <w:rPr>
+          <w:rFonts w:ascii="Courier New" w:hAnsi="Courier New" w:eastAsia="Courier New"/>
+          <w:sz w:val="17"/>
+        </w:rPr>
+        <w:t xml:space="preserve">  }</w:t>
+        <w:br/>
+      </w:r>
+      <w:r>
+        <w:rPr>
+          <w:rFonts w:ascii="Courier New" w:hAnsi="Courier New" w:eastAsia="Courier New"/>
+          <w:sz w:val="17"/>
+        </w:rPr>
+        <w:t>}</w:t>
+      </w:r>
+    </w:p>
+    <w:p>
+      <w:pPr>
+        <w:spacing w:after="120" w:line="276" w:lineRule="auto"/>
+      </w:pPr>
+      <w:r>
+        <w:rPr/>
+        <w:t>/etc/nginx/conf.d/nca.conf (the app is then at https://nca.example.org/nca/):</w:t>
+      </w:r>
+    </w:p>
+    <w:p>
+      <w:pPr>
+        <w:spacing w:after="160" w:line="276" w:lineRule="auto" w:before="40"/>
+        <w:ind w:left="283"/>
+        <w:shd w:val="clear" w:color="auto" w:fill="F2F2F2"/>
+      </w:pPr>
+      <w:r>
+        <w:rPr>
+          <w:rFonts w:ascii="Courier New" w:hAnsi="Courier New" w:eastAsia="Courier New"/>
+          <w:sz w:val="17"/>
+        </w:rPr>
+        <w:t>map $http_upgrade $connection_upgrade { default upgrade; '' close; }</w:t>
+        <w:br/>
+      </w:r>
+      <w:r>
+        <w:rPr>
+          <w:rFonts w:ascii="Courier New" w:hAnsi="Courier New" w:eastAsia="Courier New"/>
+          <w:sz w:val="17"/>
+        </w:rPr>
+        <w:br/>
+      </w:r>
+      <w:r>
+        <w:rPr>
+          <w:rFonts w:ascii="Courier New" w:hAnsi="Courier New" w:eastAsia="Courier New"/>
+          <w:sz w:val="17"/>
+        </w:rPr>
+        <w:t>server {</w:t>
+        <w:br/>
+      </w:r>
+      <w:r>
+        <w:rPr>
+          <w:rFonts w:ascii="Courier New" w:hAnsi="Courier New" w:eastAsia="Courier New"/>
+          <w:sz w:val="17"/>
+        </w:rPr>
+        <w:t xml:space="preserve">  listen 80;</w:t>
+        <w:br/>
+      </w:r>
+      <w:r>
+        <w:rPr>
+          <w:rFonts w:ascii="Courier New" w:hAnsi="Courier New" w:eastAsia="Courier New"/>
+          <w:sz w:val="17"/>
+        </w:rPr>
+        <w:t xml:space="preserve">  server_name nca.example.org;</w:t>
+        <w:br/>
+      </w:r>
+      <w:r>
+        <w:rPr>
+          <w:rFonts w:ascii="Courier New" w:hAnsi="Courier New" w:eastAsia="Courier New"/>
+          <w:sz w:val="17"/>
+        </w:rPr>
+        <w:t xml:space="preserve">  return 301 https://$host$request_uri;</w:t>
+        <w:br/>
+      </w:r>
+      <w:r>
+        <w:rPr>
+          <w:rFonts w:ascii="Courier New" w:hAnsi="Courier New" w:eastAsia="Courier New"/>
+          <w:sz w:val="17"/>
+        </w:rPr>
+        <w:t>}</w:t>
+        <w:br/>
+      </w:r>
+      <w:r>
+        <w:rPr>
+          <w:rFonts w:ascii="Courier New" w:hAnsi="Courier New" w:eastAsia="Courier New"/>
+          <w:sz w:val="17"/>
+        </w:rPr>
+        <w:br/>
+      </w:r>
+      <w:r>
+        <w:rPr>
+          <w:rFonts w:ascii="Courier New" w:hAnsi="Courier New" w:eastAsia="Courier New"/>
+          <w:sz w:val="17"/>
+        </w:rPr>
+        <w:t>server {</w:t>
+        <w:br/>
+      </w:r>
+      <w:r>
+        <w:rPr>
+          <w:rFonts w:ascii="Courier New" w:hAnsi="Courier New" w:eastAsia="Courier New"/>
+          <w:sz w:val="17"/>
+        </w:rPr>
+        <w:t xml:space="preserve">  listen 443 ssl;</w:t>
+        <w:br/>
+      </w:r>
+      <w:r>
+        <w:rPr>
+          <w:rFonts w:ascii="Courier New" w:hAnsi="Courier New" w:eastAsia="Courier New"/>
+          <w:sz w:val="17"/>
+        </w:rPr>
+        <w:t xml:space="preserve">  server_name nca.example.org;</w:t>
+        <w:br/>
+      </w:r>
+      <w:r>
+        <w:rPr>
+          <w:rFonts w:ascii="Courier New" w:hAnsi="Courier New" w:eastAsia="Courier New"/>
+          <w:sz w:val="17"/>
+        </w:rPr>
+        <w:t xml:space="preserve">  ssl_certificate     /etc/ssl/certs/nca.crt;</w:t>
+        <w:br/>
+      </w:r>
+      <w:r>
+        <w:rPr>
+          <w:rFonts w:ascii="Courier New" w:hAnsi="Courier New" w:eastAsia="Courier New"/>
+          <w:sz w:val="17"/>
+        </w:rPr>
+        <w:t xml:space="preserve">  ssl_certificate_key /etc/ssl/private/nca.key;</w:t>
+        <w:br/>
+      </w:r>
+      <w:r>
+        <w:rPr>
+          <w:rFonts w:ascii="Courier New" w:hAnsi="Courier New" w:eastAsia="Courier New"/>
+          <w:sz w:val="17"/>
+        </w:rPr>
+        <w:t xml:space="preserve">  client_max_body_size 60m;       # the app accepts files up to 50 MB</w:t>
+        <w:br/>
+      </w:r>
+      <w:r>
+        <w:rPr>
+          <w:rFonts w:ascii="Courier New" w:hAnsi="Courier New" w:eastAsia="Courier New"/>
+          <w:sz w:val="17"/>
+        </w:rPr>
+        <w:br/>
+      </w:r>
+      <w:r>
+        <w:rPr>
+          <w:rFonts w:ascii="Courier New" w:hAnsi="Courier New" w:eastAsia="Courier New"/>
+          <w:sz w:val="17"/>
+        </w:rPr>
+        <w:t xml:space="preserve">  location / {</w:t>
+        <w:br/>
+      </w:r>
+      <w:r>
+        <w:rPr>
+          <w:rFonts w:ascii="Courier New" w:hAnsi="Courier New" w:eastAsia="Courier New"/>
+          <w:sz w:val="17"/>
+        </w:rPr>
+        <w:t xml:space="preserve">    proxy_pass http://127.0.0.1:3838/;</w:t>
+        <w:br/>
+      </w:r>
+      <w:r>
+        <w:rPr>
+          <w:rFonts w:ascii="Courier New" w:hAnsi="Courier New" w:eastAsia="Courier New"/>
+          <w:sz w:val="17"/>
+        </w:rPr>
+        <w:t xml:space="preserve">    proxy_http_version 1.1;</w:t>
+        <w:br/>
+      </w:r>
+      <w:r>
+        <w:rPr>
+          <w:rFonts w:ascii="Courier New" w:hAnsi="Courier New" w:eastAsia="Courier New"/>
+          <w:sz w:val="17"/>
+        </w:rPr>
+        <w:t xml:space="preserve">    proxy_set_header Upgrade $http_upgrade;</w:t>
+        <w:br/>
+      </w:r>
+      <w:r>
+        <w:rPr>
+          <w:rFonts w:ascii="Courier New" w:hAnsi="Courier New" w:eastAsia="Courier New"/>
+          <w:sz w:val="17"/>
+        </w:rPr>
+        <w:t xml:space="preserve">    proxy_set_header Connection $connection_upgrade;</w:t>
+        <w:br/>
+      </w:r>
+      <w:r>
+        <w:rPr>
+          <w:rFonts w:ascii="Courier New" w:hAnsi="Courier New" w:eastAsia="Courier New"/>
+          <w:sz w:val="17"/>
+        </w:rPr>
+        <w:t xml:space="preserve">    proxy_set_header Host $host;</w:t>
+        <w:br/>
+      </w:r>
+      <w:r>
+        <w:rPr>
+          <w:rFonts w:ascii="Courier New" w:hAnsi="Courier New" w:eastAsia="Courier New"/>
+          <w:sz w:val="17"/>
+        </w:rPr>
+        <w:t xml:space="preserve">    proxy_set_header X-Forwarded-Proto $scheme;</w:t>
+        <w:br/>
+      </w:r>
+      <w:r>
+        <w:rPr>
+          <w:rFonts w:ascii="Courier New" w:hAnsi="Courier New" w:eastAsia="Courier New"/>
+          <w:sz w:val="17"/>
+        </w:rPr>
+        <w:t xml:space="preserve">    proxy_read_timeout 3600s;     # do not cut off an open session</w:t>
+        <w:br/>
+      </w:r>
+      <w:r>
+        <w:rPr>
+          <w:rFonts w:ascii="Courier New" w:hAnsi="Courier New" w:eastAsia="Courier New"/>
+          <w:sz w:val="17"/>
+        </w:rPr>
+        <w:t xml:space="preserve">    proxy_buffering off;</w:t>
+        <w:br/>
+      </w:r>
+      <w:r>
+        <w:rPr>
+          <w:rFonts w:ascii="Courier New" w:hAnsi="Courier New" w:eastAsia="Courier New"/>
+          <w:sz w:val="17"/>
+        </w:rPr>
+        <w:t xml:space="preserve">  }</w:t>
+        <w:br/>
+      </w:r>
+      <w:r>
+        <w:rPr>
+          <w:rFonts w:ascii="Courier New" w:hAnsi="Courier New" w:eastAsia="Courier New"/>
+          <w:sz w:val="17"/>
+        </w:rPr>
+        <w:t>}</w:t>
+      </w:r>
+    </w:p>
+    <w:p>
+      <w:pPr>
+        <w:spacing w:after="120" w:line="276" w:lineRule="auto"/>
+      </w:pPr>
+      <w:r>
+        <w:rPr/>
+        <w:t>/home/shiny/.Renviron (owner shiny, mode 0600):</w:t>
+      </w:r>
+    </w:p>
+    <w:p>
+      <w:pPr>
+        <w:spacing w:after="160" w:line="276" w:lineRule="auto" w:before="40"/>
+        <w:ind w:left="283"/>
+        <w:shd w:val="clear" w:color="auto" w:fill="F2F2F2"/>
+      </w:pPr>
+      <w:r>
+        <w:rPr>
+          <w:rFonts w:ascii="Courier New" w:hAnsi="Courier New" w:eastAsia="Courier New"/>
+          <w:sz w:val="17"/>
+        </w:rPr>
+        <w:t>NCA_GXP_DIR=/srv/nca-gxp</w:t>
+        <w:br/>
+      </w:r>
+      <w:r>
+        <w:rPr>
+          <w:rFonts w:ascii="Courier New" w:hAnsi="Courier New" w:eastAsia="Courier New"/>
+          <w:sz w:val="17"/>
+        </w:rPr>
+        <w:t>NCA_GXP_KEY=&lt;a long passphrase, kept only here and in your password vault&gt;</w:t>
+        <w:br/>
+      </w:r>
+      <w:r>
+        <w:rPr>
+          <w:rFonts w:ascii="Courier New" w:hAnsi="Courier New" w:eastAsia="Courier New"/>
+          <w:sz w:val="17"/>
+        </w:rPr>
+        <w:t>NCA_GXP_ORG=Your Organisation</w:t>
+        <w:br/>
+      </w:r>
+      <w:r>
+        <w:rPr>
+          <w:rFonts w:ascii="Courier New" w:hAnsi="Courier New" w:eastAsia="Courier New"/>
+          <w:sz w:val="17"/>
+        </w:rPr>
+        <w:t>NCA_GXP_WORK_HOURS=07:00-19:00</w:t>
+      </w:r>
+    </w:p>
+    <w:p>
+      <w:pPr>
+        <w:spacing w:after="120" w:line="276" w:lineRule="auto"/>
+      </w:pPr>
+      <w:r>
+        <w:rPr/>
+        <w:t>/etc/sudoers.d/nca (edit with visudo -f /etc/sudoers.d/nca; replace jdoe by the system owner's account, and /usr/bin/Rscript by the path that which Rscript shows):</w:t>
+      </w:r>
+    </w:p>
+    <w:p>
+      <w:pPr>
+        <w:spacing w:after="160" w:line="276" w:lineRule="auto" w:before="40"/>
+        <w:ind w:left="283"/>
+        <w:shd w:val="clear" w:color="auto" w:fill="F2F2F2"/>
+      </w:pPr>
+      <w:r>
+        <w:rPr>
+          <w:rFonts w:ascii="Courier New" w:hAnsi="Courier New" w:eastAsia="Courier New"/>
+          <w:sz w:val="17"/>
+        </w:rPr>
+        <w:t>jdoe ALL=(shiny) /usr/bin/Rscript /srv/shiny-server/nca/gxp/manage_users.R *</w:t>
+      </w:r>
+    </w:p>
+    <w:p>
+      <w:pPr>
+        <w:spacing w:after="120" w:line="276" w:lineRule="auto"/>
+      </w:pPr>
+      <w:r>
+        <w:rPr/>
+        <w:t>After a change to these files, restart Shiny Server and reload nginx. Then check that the app starts in controlled mode: the audit trail's first app_started entry names the controlled directory, and a file of 5 MB or more uploads without an error.</w:t>
+      </w:r>
+    </w:p>
+    <w:p>
+      <w:pPr>
+        <w:pStyle w:val="Kop3"/>
+      </w:pPr>
+      <w:r>
+        <w:rPr/>
         <w:t>Managing Accounts</w:t>
       </w:r>
     </w:p>
@@ -33867,7 +34271,7 @@
       </w:pPr>
       <w:r>
         <w:rPr/>
-        <w:t>The system owner runs every command as: sudo -u shiny Rscript gxp/manage_users.R command. Every change is logged under the system owner's own name, with the reason given. There is no delete: a user ID is never used again.</w:t>
+        <w:t>The system owner runs every command as: sudo -H -u shiny Rscript /srv/shiny-server/nca/gxp/manage_users.R command. Every change is logged under the system owner's own name, with the reason given. There is no delete: a user ID is never used again.</w:t>
       </w:r>
     </w:p>
     <w:tbl>
@@ -34451,7 +34855,156 @@
       </w:pPr>
       <w:r>
         <w:rPr/>
-        <w:t>For training and for Tutorial 8, run controlled mode on your own computer. Put NCA_GXP_DIR (a folder on your local disk, not in OneDrive or a network folder), NCA_GXP_KEY and NCA_GXP_ORG in the .Renviron file in your home folder, run Rscript gxp/manage_users.R init and add from the app folder (no sudo), and start the app as usual. A training installation is not a qualified setup: you own the folder that holds its audit trail.</w:t>
+        <w:t>For training and for Tutorial 8, run controlled mode on your own computer. Use a separate copy of the app folder for it: the settings go in a file in that folder, so the app runs in controlled mode only when you start it from there, and your normal installation stays as it is. A training installation is not a qualified setup, because you own the folder that holds its audit trail.</w:t>
+      </w:r>
+    </w:p>
+    <w:p>
+      <w:pPr>
+        <w:spacing w:after="120" w:line="276" w:lineRule="auto"/>
+      </w:pPr>
+      <w:r>
+        <w:rPr/>
+        <w:t>On macOS and Linux:</w:t>
+      </w:r>
+    </w:p>
+    <w:p>
+      <w:pPr>
+        <w:spacing w:after="120" w:line="276" w:lineRule="auto"/>
+      </w:pPr>
+      <w:r>
+        <w:rPr/>
+        <w:t>1. Install the app as described in Installing the App on Your Own Computer. The installation script also installs shinymanager, DBI and RSQLite.</w:t>
+      </w:r>
+    </w:p>
+    <w:p>
+      <w:pPr>
+        <w:spacing w:after="120" w:line="276" w:lineRule="auto"/>
+      </w:pPr>
+      <w:r>
+        <w:rPr/>
+        <w:t>2. Copy the app folder, for example to ~/nca-training-app, and create an empty folder for the controlled data, for example ~/nca-training-data. Keep both on your local disk, not in OneDrive, Dropbox or a network folder: the audit trail can be damaged there.</w:t>
+      </w:r>
+    </w:p>
+    <w:p>
+      <w:pPr>
+        <w:spacing w:after="120" w:line="276" w:lineRule="auto"/>
+      </w:pPr>
+      <w:r>
+        <w:rPr/>
+        <w:t>3. In ~/nca-training-app, create a text file named .Renviron with these three lines (use the full path of your data folder):</w:t>
+      </w:r>
+    </w:p>
+    <w:p>
+      <w:pPr>
+        <w:spacing w:after="160" w:line="276" w:lineRule="auto" w:before="40"/>
+        <w:ind w:left="283"/>
+        <w:shd w:val="clear" w:color="auto" w:fill="F2F2F2"/>
+      </w:pPr>
+      <w:r>
+        <w:rPr>
+          <w:rFonts w:ascii="Courier New" w:hAnsi="Courier New" w:eastAsia="Courier New"/>
+          <w:sz w:val="17"/>
+        </w:rPr>
+        <w:t>NCA_GXP_DIR=/Users/yourname/nca-training-data</w:t>
+        <w:br/>
+      </w:r>
+      <w:r>
+        <w:rPr>
+          <w:rFonts w:ascii="Courier New" w:hAnsi="Courier New" w:eastAsia="Courier New"/>
+          <w:sz w:val="17"/>
+        </w:rPr>
+        <w:t>NCA_GXP_KEY=training-only-passphrase</w:t>
+        <w:br/>
+      </w:r>
+      <w:r>
+        <w:rPr>
+          <w:rFonts w:ascii="Courier New" w:hAnsi="Courier New" w:eastAsia="Courier New"/>
+          <w:sz w:val="17"/>
+        </w:rPr>
+        <w:t>NCA_GXP_ORG=Training</w:t>
+      </w:r>
+    </w:p>
+    <w:p>
+      <w:pPr>
+        <w:spacing w:after="120" w:line="276" w:lineRule="auto"/>
+      </w:pPr>
+      <w:r>
+        <w:rPr/>
+        <w:t>4. Open a terminal, go to the app folder and create the audit trail and two accounts:</w:t>
+      </w:r>
+    </w:p>
+    <w:p>
+      <w:pPr>
+        <w:spacing w:after="160" w:line="276" w:lineRule="auto" w:before="40"/>
+        <w:ind w:left="283"/>
+        <w:shd w:val="clear" w:color="auto" w:fill="F2F2F2"/>
+      </w:pPr>
+      <w:r>
+        <w:rPr>
+          <w:rFonts w:ascii="Courier New" w:hAnsi="Courier New" w:eastAsia="Courier New"/>
+          <w:sz w:val="17"/>
+        </w:rPr>
+        <w:t>cd ~/nca-training-app</w:t>
+        <w:br/>
+      </w:r>
+      <w:r>
+        <w:rPr>
+          <w:rFonts w:ascii="Courier New" w:hAnsi="Courier New" w:eastAsia="Courier New"/>
+          <w:sz w:val="17"/>
+        </w:rPr>
+        <w:t>Rscript gxp/manage_users.R init</w:t>
+        <w:br/>
+      </w:r>
+      <w:r>
+        <w:rPr>
+          <w:rFonts w:ascii="Courier New" w:hAnsi="Courier New" w:eastAsia="Courier New"/>
+          <w:sz w:val="17"/>
+        </w:rPr>
+        <w:t>Rscript gxp/manage_users.R add trainee1 "Trainee One" analyst "training"</w:t>
+        <w:br/>
+      </w:r>
+      <w:r>
+        <w:rPr>
+          <w:rFonts w:ascii="Courier New" w:hAnsi="Courier New" w:eastAsia="Courier New"/>
+          <w:sz w:val="17"/>
+        </w:rPr>
+        <w:t>Rscript gxp/manage_users.R add trainer1 "Trainer One" reviewer "training"</w:t>
+      </w:r>
+    </w:p>
+    <w:p>
+      <w:pPr>
+        <w:spacing w:after="120" w:line="276" w:lineRule="auto"/>
+      </w:pPr>
+      <w:r>
+        <w:rPr/>
+        <w:t>5. Start the app from the same folder: Rscript -e "shiny::runApp(launch.browser = TRUE)". (In RStudio, open the folder as a project with File &gt; New Project &gt; Existing Directory: R then starts in this folder and reads its .Renviron file.)</w:t>
+      </w:r>
+    </w:p>
+    <w:p>
+      <w:pPr>
+        <w:spacing w:after="120" w:line="276" w:lineRule="auto"/>
+      </w:pPr>
+      <w:r>
+        <w:rPr/>
+        <w:t>6. Sign in as trainee1 with admin and choose a new password. Open a second browser, or a private window, and sign in there as trainer1. You can now do Tutorial 8.</w:t>
+      </w:r>
+    </w:p>
+    <w:p>
+      <w:pPr>
+        <w:spacing w:after="120" w:line="276" w:lineRule="auto"/>
+      </w:pPr>
+      <w:r>
+        <w:rPr/>
+        <w:t>On Windows the steps are the same, with these differences. Use forward slashes in the path in .Renviron (NCA_GXP_DIR=C:/Users/yourname/nca-training-data). Create .Renviron in the app folder with Notepad: choose All files as the file type, so it is not saved as .Renviron.txt. Run the commands in a Command Prompt in the app folder; if Rscript is not found, use its full path, for example "C:\Program Files\R\R-4.6.0\bin\Rscript.exe". Security alerts are written to security_alerts.log in the data folder, because Windows has no logger.</w:t>
+      </w:r>
+    </w:p>
+    <w:p>
+      <w:pPr>
+        <w:spacing w:after="120" w:line="276" w:lineRule="auto"/>
+      </w:pPr>
+      <w:r>
+        <w:rPr/>
+        <w:t>After the training, delete both folders. They hold only training data; your normal installation is untouched.</w:t>
       </w:r>
     </w:p>
     <w:p>

</xml_diff>